<commit_message>
Remove draft label and preserve manual paragraphs and localized Word headings
</commit_message>
<xml_diff>
--- a/static/downloads/ai-audit-pilot.docx
+++ b/static/downloads/ai-audit-pilot.docx
@@ -36,7 +36,7 @@
                 <w:color w:val="FF7E18"/>
                 <w:sz w:val="24"/>
               </w:rPr>
-              <w:t>ЧЕРНОВАЯ МЕТОДИКА</w:t>
+              <w:t>МЕТОДИКА</w:t>
             </w:r>
           </w:p>
           <w:p>
@@ -210,7 +210,7 @@
     </w:p>
     <w:p>
       <w:r>
-        <w:t>Статус документа: черновик для обсуждения и апробации. Приведённые целевые значения и экономические диапазоны являются шаблонами для согласования, а не обещаниями результата.</w:t>
+        <w:t>Методика предназначена для обсуждения и практической апробации. Приведённые целевые значения и экономические диапазоны являются шаблонами для согласования, а не обещаниями результата.</w:t>
       </w:r>
     </w:p>
     <w:p>
@@ -5435,7 +5435,7 @@
     </w:p>
     <w:p>
       <w:r>
-        <w:t>Целевые пороги должны утверждаться после baseline. Для чернового пилота допустимо задать диапазон, но нельзя объявлять его достигнутым до тестирования.</w:t>
+        <w:t>Целевые пороги должны утверждаться после baseline. Для первого пилота допустимо задать диапазон, но нельзя объявлять его достигнутым до тестирования.</w:t>
       </w:r>
     </w:p>
     <w:p>
@@ -9316,7 +9316,7 @@
         <w:pStyle w:val="1"/>
       </w:pPr>
       <w:r>
-        <w:t>17. Черновой вариант реализации</w:t>
+        <w:t>17. Пример реализации</w:t>
       </w:r>
     </w:p>
     <w:p>
@@ -11342,7 +11342,7 @@
         <w:pStyle w:val="1"/>
       </w:pPr>
       <w:r>
-        <w:t>21. Ограничения черновика</w:t>
+        <w:t>21. Ограничения методики</w:t>
       </w:r>
     </w:p>
     <w:p>
@@ -11566,7 +11566,7 @@
       <w:jc w:val="right"/>
     </w:pPr>
     <w:r>
-      <w:t>Черновая методика | AI-аудит и пилотное внедрение</w:t>
+      <w:t>Методика | AI-аудит и пилотное внедрение</w:t>
     </w:r>
   </w:p>
 </w:hdr>

</xml_diff>